<commit_message>
qSpark: add observability (OTel/StatsD/Grafana) and ClearStreet broker integration bullets
</commit_message>
<xml_diff>
--- a/Arkady_Miasnikov_CV_Updated.docx
+++ b/Arkady_Miasnikov_CV_Updated.docx
@@ -90,6 +90,22 @@
       </w:pPr>
       <w:r>
         <w:t>Drove internal adoption of AI coding tools - established KPI tracking of AI contribution to MRs (later adopted org-wide as a project metric).</w:t>
+      </w:r>
+    </w:p>
+    <w:p>
+      <w:pPr>
+        <w:pStyle w:val="ListBullet"/>
+      </w:pPr>
+      <w:r>
+        <w:t>Instrumented the management service with OpenTelemetry counters and StatsD metrics (trading commands, firm stop, locates, cancel orders, position adjustments) and built the corresponding Grafana dashboard for production visibility.</w:t>
+      </w:r>
+    </w:p>
+    <w:p>
+      <w:pPr>
+        <w:pStyle w:val="ListBullet"/>
+      </w:pPr>
+      <w:r>
+        <w:t>Integrated ClearStreet as the primary broker/clearing firm: implemented BOD file ingestion via SFTP, easy-to-borrow data sync (with Curvature/Velocity as secondary sources), locates pipeline, and overnight financing report - covering the full daily settlement cycle.</w:t>
       </w:r>
     </w:p>
     <w:p>

</xml_diff>

<commit_message>
fix: merge instrumentation and EMS bullets, drop verbose trading-command list
</commit_message>
<xml_diff>
--- a/Arkady_Miasnikov_CV_Updated.docx
+++ b/Arkady_Miasnikov_CV_Updated.docx
@@ -20,7 +20,7 @@
         <w:pStyle w:val="Heading1"/>
       </w:pPr>
       <w:r>
-        <w:t>Software Engineer experienced in leading development projects from inception to full implementation</w:t>
+        <w:t>Backend and systems engineer — trading, security, and data infrastructure</w:t>
       </w:r>
     </w:p>
     <w:p>
@@ -41,7 +41,7 @@
         <w:pStyle w:val="Heading2"/>
       </w:pPr>
       <w:r>
-        <w:t>2023-present: Software Engineer - qSpark (HFT trading platform)</w:t>
+        <w:t>2024-present: Software Engineer - qSpark (HFT trading platform)</w:t>
       </w:r>
     </w:p>
     <w:p>
@@ -49,7 +49,7 @@
         <w:pStyle w:val="ListBullet"/>
       </w:pPr>
       <w:r>
-        <w:t>Maintained and extended a mid-size Django/FastAPI backend serving US regulatory requirements; on-call shifts included diagnosing and fixing legacy code issues in real time under pressure, including patching both code and data in production during live incidents.</w:t>
+        <w:t>Conceived and implemented an Airflow-based log anomaly detector (Markov fuzzing + Jaccard clustering) that surfaces noisy warning/error pattern shifts across production logs - recognized as a significant observability contribution.</w:t>
       </w:r>
     </w:p>
     <w:p>
@@ -65,7 +65,23 @@
         <w:pStyle w:val="ListBullet"/>
       </w:pPr>
       <w:r>
-        <w:t>Conceived and implemented an Airflow-based log anomaly detector (Markov fuzzing + Jaccard clustering) that surfaces noisy warning/error pattern shifts across production logs - praised internally and recognized as a significant observability contribution.</w:t>
+        <w:t>Instrumented the management service with OpenTelemetry/StatsD metrics and built the corresponding Grafana dashboard; extended the automatic liquidation flow (EMS) and drove Django version migrations across multiple services.</w:t>
+      </w:r>
+    </w:p>
+    <w:p>
+      <w:pPr>
+        <w:pStyle w:val="ListBullet"/>
+      </w:pPr>
+      <w:r>
+        <w:t>Onboarded Curvature as a new locate/easy-to-borrow data provider alongside the existing ClearStreet integration; extended the BOD pipeline, locates processing, and overnight financing report to handle multiple broker data sources.</w:t>
+      </w:r>
+    </w:p>
+    <w:p>
+      <w:pPr>
+        <w:pStyle w:val="ListBullet"/>
+      </w:pPr>
+      <w:r>
+        <w:t>Owned backend services for US regulatory compliance across the Django/FastAPI stack; on-call included live production patching under pressure.</w:t>
       </w:r>
     </w:p>
     <w:p>
@@ -81,31 +97,7 @@
         <w:pStyle w:val="ListBullet"/>
       </w:pPr>
       <w:r>
-        <w:t>Contributed to automatic liquidation flow (EMS) and Django version migrations across multiple services.</w:t>
-      </w:r>
-    </w:p>
-    <w:p>
-      <w:pPr>
-        <w:pStyle w:val="ListBullet"/>
-      </w:pPr>
-      <w:r>
-        <w:t>Drove internal adoption of AI coding tools - established KPI tracking of AI contribution to MRs (later adopted org-wide as a project metric).</w:t>
-      </w:r>
-    </w:p>
-    <w:p>
-      <w:pPr>
-        <w:pStyle w:val="ListBullet"/>
-      </w:pPr>
-      <w:r>
-        <w:t>Instrumented the management service with OpenTelemetry counters and StatsD metrics (trading commands, firm stop, locates, cancel orders, position adjustments) and built the corresponding Grafana dashboard for production visibility.</w:t>
-      </w:r>
-    </w:p>
-    <w:p>
-      <w:pPr>
-        <w:pStyle w:val="ListBullet"/>
-      </w:pPr>
-      <w:r>
-        <w:t>Onboarded Curvature as a new locate/easy-to-borrow data provider alongside the existing ClearStreet integration; extended the BOD pipeline, locates processing, and overnight financing report to handle multiple broker data sources.</w:t>
+        <w:t>Established KPI tracking of AI coding tool contribution to MRs, later adopted org-wide as a project metric.</w:t>
       </w:r>
     </w:p>
     <w:p>
@@ -163,7 +155,7 @@
     </w:p>
     <w:p>
       <w:r>
-        <w:t>Go, Python, ClickHouse, SQL, AI</w:t>
+        <w:t>Go, Python, ClickHouse, SQL</w:t>
       </w:r>
     </w:p>
     <w:p>
@@ -208,7 +200,7 @@
     </w:p>
     <w:p>
       <w:r>
-        <w:t>Python, BigQuery, Redis, SQL, AI, k8s, Azure, Docker</w:t>
+        <w:t>Python, BigQuery, Redis, SQL, k8s, Azure, Docker</w:t>
       </w:r>
     </w:p>
     <w:p>
@@ -269,7 +261,7 @@
     </w:p>
     <w:p>
       <w:r>
-        <w:t>Go, C++, Python, ElasticSearch, Redis, Apache Kafka, Prometheus, Grafana, Kibana, Megalog, Jaeger, SQL, k8s, AWS, Docker, AI</w:t>
+        <w:t>Go, C++, Python, ElasticSearch, Redis, Apache Kafka, Prometheus, Grafana, Kibana, Megalog, Jaeger, SQL, k8s, AWS, Docker, ML</w:t>
       </w:r>
     </w:p>
     <w:p>

</xml_diff>